<commit_message>
fix: update document title and formatting in technical report
</commit_message>
<xml_diff>
--- a/BankScope_naucno_tehnicki_izvestaj_v2.docx
+++ b/BankScope_naucno_tehnicki_izvestaj_v2.docx
@@ -9,46 +9,6 @@
         <w:spacing w:before="240"/>
         <w:jc w:val="center"/>
       </w:pPr>
-      <w:r>
-        <w:rPr>
-          <w:noProof/>
-        </w:rPr>
-        <w:drawing>
-          <wp:inline distT="0" distB="0" distL="0" distR="0" wp14:anchorId="3560894A" wp14:editId="537F9C9F">
-            <wp:extent cx="6035040" cy="1562010"/>
-            <wp:effectExtent l="0" t="0" r="0" b="0"/>
-            <wp:docPr id="1" name="Picture 1"/>
-            <wp:cNvGraphicFramePr>
-              <a:graphicFrameLocks xmlns:a="http://schemas.openxmlformats.org/drawingml/2006/main" noChangeAspect="1"/>
-            </wp:cNvGraphicFramePr>
-            <a:graphic xmlns:a="http://schemas.openxmlformats.org/drawingml/2006/main">
-              <a:graphicData uri="http://schemas.openxmlformats.org/drawingml/2006/picture">
-                <pic:pic xmlns:pic="http://schemas.openxmlformats.org/drawingml/2006/picture">
-                  <pic:nvPicPr>
-                    <pic:cNvPr id="0" name="cover-mark.png"/>
-                    <pic:cNvPicPr/>
-                  </pic:nvPicPr>
-                  <pic:blipFill>
-                    <a:blip r:embed="rId8"/>
-                    <a:stretch>
-                      <a:fillRect/>
-                    </a:stretch>
-                  </pic:blipFill>
-                  <pic:spPr>
-                    <a:xfrm>
-                      <a:off x="0" y="0"/>
-                      <a:ext cx="6035040" cy="1562010"/>
-                    </a:xfrm>
-                    <a:prstGeom prst="rect">
-                      <a:avLst/>
-                    </a:prstGeom>
-                  </pic:spPr>
-                </pic:pic>
-              </a:graphicData>
-            </a:graphic>
-          </wp:inline>
-        </w:drawing>
-      </w:r>
     </w:p>
     <w:p>
       <w:pPr>
@@ -65,7 +25,7 @@
         <w:jc w:val="center"/>
       </w:pPr>
       <w:r>
-        <w:t>Naučno-tehnički izveštaj o arhitekturi, evaluaciji i pouzdanosti</w:t>
+        <w:t>BankScope</w:t>
       </w:r>
     </w:p>
     <w:p>
@@ -377,11 +337,22 @@
     </w:p>
     <w:p>
       <w:pPr>
+        <w:spacing w:after="20"/>
+      </w:pPr>
+    </w:p>
+    <w:p>
+      <w:pPr>
+        <w:spacing w:after="20"/>
+      </w:pPr>
+    </w:p>
+    <w:p>
+      <w:pPr>
         <w:pStyle w:val="Heading1"/>
       </w:pPr>
       <w:bookmarkStart w:id="4" w:name="_Toc239083267"/>
       <w:bookmarkStart w:id="5" w:name="_Toc239155556"/>
       <w:r>
+        <w:lastRenderedPageBreak/>
         <w:t>Sadržaj</w:t>
       </w:r>
       <w:bookmarkEnd w:id="4"/>
@@ -2656,7 +2627,6 @@
         <w:rPr>
           <w:noProof/>
         </w:rPr>
-        <w:lastRenderedPageBreak/>
         <w:t>9. Diskusija</w:t>
       </w:r>
       <w:r>
@@ -2785,6 +2755,7 @@
         <w:rPr>
           <w:noProof/>
         </w:rPr>
+        <w:lastRenderedPageBreak/>
         <w:t>9.2. Kratke razvojne pouke</w:t>
       </w:r>
       <w:r>
@@ -3252,7 +3223,7 @@
                     <pic:cNvPicPr/>
                   </pic:nvPicPr>
                   <pic:blipFill>
-                    <a:blip r:embed="rId9"/>
+                    <a:blip r:embed="rId8"/>
                     <a:stretch>
                       <a:fillRect/>
                     </a:stretch>
@@ -5016,7 +4987,7 @@
                     <pic:cNvPicPr/>
                   </pic:nvPicPr>
                   <pic:blipFill>
-                    <a:blip r:embed="rId10"/>
+                    <a:blip r:embed="rId9"/>
                     <a:stretch>
                       <a:fillRect/>
                     </a:stretch>
@@ -5209,7 +5180,7 @@
                     <pic:cNvPicPr/>
                   </pic:nvPicPr>
                   <pic:blipFill>
-                    <a:blip r:embed="rId11"/>
+                    <a:blip r:embed="rId10"/>
                     <a:stretch>
                       <a:fillRect/>
                     </a:stretch>
@@ -5295,7 +5266,7 @@
                     <pic:cNvPicPr/>
                   </pic:nvPicPr>
                   <pic:blipFill>
-                    <a:blip r:embed="rId12"/>
+                    <a:blip r:embed="rId11"/>
                     <a:stretch>
                       <a:fillRect/>
                     </a:stretch>
@@ -5440,7 +5411,7 @@
                     <pic:cNvPicPr/>
                   </pic:nvPicPr>
                   <pic:blipFill>
-                    <a:blip r:embed="rId13"/>
+                    <a:blip r:embed="rId12"/>
                     <a:stretch>
                       <a:fillRect/>
                     </a:stretch>
@@ -5524,7 +5495,7 @@
                     <pic:cNvPicPr/>
                   </pic:nvPicPr>
                   <pic:blipFill>
-                    <a:blip r:embed="rId14"/>
+                    <a:blip r:embed="rId13"/>
                     <a:stretch>
                       <a:fillRect/>
                     </a:stretch>
@@ -5599,7 +5570,7 @@
                     <pic:cNvPicPr/>
                   </pic:nvPicPr>
                   <pic:blipFill>
-                    <a:blip r:embed="rId15"/>
+                    <a:blip r:embed="rId14"/>
                     <a:stretch>
                       <a:fillRect/>
                     </a:stretch>
@@ -5683,7 +5654,7 @@
                     <pic:cNvPicPr/>
                   </pic:nvPicPr>
                   <pic:blipFill>
-                    <a:blip r:embed="rId16"/>
+                    <a:blip r:embed="rId15"/>
                     <a:stretch>
                       <a:fillRect/>
                     </a:stretch>
@@ -5773,7 +5744,7 @@
                     <pic:cNvPicPr/>
                   </pic:nvPicPr>
                   <pic:blipFill>
-                    <a:blip r:embed="rId17"/>
+                    <a:blip r:embed="rId16"/>
                     <a:stretch>
                       <a:fillRect/>
                     </a:stretch>
@@ -6853,7 +6824,7 @@
                     <pic:cNvPicPr/>
                   </pic:nvPicPr>
                   <pic:blipFill>
-                    <a:blip r:embed="rId18"/>
+                    <a:blip r:embed="rId17"/>
                     <a:stretch>
                       <a:fillRect/>
                     </a:stretch>
@@ -9573,8 +9544,8 @@
       </w:pPr>
     </w:p>
     <w:sectPr>
-      <w:headerReference w:type="default" r:id="rId19"/>
-      <w:footerReference w:type="default" r:id="rId20"/>
+      <w:headerReference w:type="default" r:id="rId18"/>
+      <w:footerReference w:type="default" r:id="rId19"/>
       <w:pgSz w:w="11906" w:h="16838"/>
       <w:pgMar w:top="1020" w:right="1134" w:bottom="1020" w:left="1134" w:header="425" w:footer="425" w:gutter="0"/>
       <w:cols w:space="720"/>

</xml_diff>